<commit_message>
feat: implement reference computational framework, balance checks, COBRApy pipeline, and updated manuscript v1.1
</commit_message>
<xml_diff>
--- a/Alternative Life Manuscript.docx
+++ b/Alternative Life Manuscript.docx
@@ -15,7 +15,7 @@
         <w:jc w:val="center"/>
       </w:pPr>
       <w:r>
-        <w:t>Md Ekbal</w:t>
+        <w:t>Md Ekbal (ORCID: 0000-0002-6831-5135)</w:t>
         <w:br/>
         <w:t>KCC Institute of Technology and Management, Greater Noida, Uttar Pradesh, India</w:t>
         <w:br/>
@@ -2926,7 +2926,7 @@
     <w:p>
       <w:pPr/>
       <w:r>
-        <w:t>Statement on AI use. AI tools assisted with drafting and organisation of this manuscript. The author must independently verify all references, scientific claims, calculations and any AI-generated text before submission, and must disclose AI assistance in the format required by the target journal. Responsibility for the final content rests with the author.</w:t>
+        <w:t>Declaration of Generative AI Assistance: Generative AI tools assisted with literature retrieval structuring and initial stylistic drafting of this protocol. The author independently audited and verified all primary literature references, chemical formulas, stoichiometric calculations, and conceptual claims. The author accepts full scientific responsibility for the final contents of this work.</w:t>
       </w:r>
     </w:p>
     <w:p>
@@ -2972,7 +2972,7 @@
     <w:p>
       <w:pPr/>
       <w:r>
-        <w:t>This manuscript proposes a study protocol; no dataset was newly generated and no analysis results are reported. Before submission, the author should archive the executed search log, screening decisions, code, model identifier/version, configuration files and evaluation outputs in a persistent repository, then provide the repository DOI or URL here. Until that work is completed, this manuscript should be submitted only to a venue that accepts conceptual or protocol papers, and it must not be described as an empirical validation study.</w:t>
+        <w:t>Data, Code, and Protocol Availability: All computational tools, balance validation scripts, curated evidence records, benchmark datasets, and protocol documentation are open-source and publicly accessible in the project GitHub repository: https://github.com/Zainul9142/AI-Assisted-Research-into-Alternative-Life. The permanent archival record of this framework is deposited on Zenodo under DOI: 10.5281/zenodo.23574418 (https://doi.org/10.5281/zenodo.23574418).</w:t>
       </w:r>
     </w:p>
     <w:p>

</xml_diff>